<commit_message>
Deploying to gh-pages from @ Morrison-Lab/mds@cda43e840c899b27c7ae5b6acad54cc6fa9e9cc0 🚀
</commit_message>
<xml_diff>
--- a/algebra-exponentials.docx
+++ b/algebra-exponentials.docx
@@ -15,7 +15,7 @@
         <w:pStyle w:val="Date"/>
       </w:pPr>
       <w:r>
-        <w:t xml:space="preserve">Last modified: 2026-10-27 09:35:20 (PDT)</w:t>
+        <w:t xml:space="preserve">Last modified: 2026-10-27 11:01:31 (PDT)</w:t>
       </w:r>
     </w:p>
     <w:bookmarkStart w:id="30" w:name="sec-polynomials"/>
@@ -13220,7 +13220,7 @@
       </w:r>
     </w:p>
     <w:bookmarkEnd w:id="61"/>
-    <w:bookmarkStart w:id="146" w:name="exponentials-and-logarithms"/>
+    <w:bookmarkStart w:id="150" w:name="exponentials-and-logarithms"/>
     <w:p>
       <w:pPr>
         <w:pStyle w:val="Heading2"/>
@@ -22244,7 +22244,7 @@
       </m:oMathPara>
     </w:p>
     <w:bookmarkEnd w:id="103"/>
-    <w:bookmarkStart w:id="104" w:name="exm-contour-line"/>
+    <w:bookmarkStart w:id="108" w:name="exm-contour-line"/>
     <w:p>
       <w:pPr>
         <w:pStyle w:val="FirstParagraph"/>
@@ -22808,8 +22808,289 @@
         <w:t xml:space="preserve">.</w:t>
       </w:r>
     </w:p>
-    <w:bookmarkEnd w:id="104"/>
-    <w:bookmarkStart w:id="105" w:name="rem-contour-line-surface"/>
+    <w:tbl>
+      <w:tblPr>
+        <w:tblStyle w:val="Table"/>
+        <w:tblW w:type="pct" w:w="5000"/>
+        <w:tblLayout w:type="fixed"/>
+        <w:tblLook w:firstRow="0" w:lastRow="0" w:firstColumn="0" w:lastColumn="0" w:noHBand="0" w:noVBand="0" w:val="0000"/>
+      </w:tblPr>
+      <w:tblGrid>
+        <w:gridCol w:w="7920"/>
+      </w:tblGrid>
+      <w:tr>
+        <w:tc>
+          <w:tcPr/>
+          <w:bookmarkStart w:id="107" w:name="fig-contour-line"/>
+          <w:p>
+            <w:pPr>
+              <w:jc w:val="center"/>
+            </w:pPr>
+            <w:r>
+              <w:drawing>
+                <wp:inline>
+                  <wp:extent cx="4620126" cy="4158113"/>
+                  <wp:effectExtent b="0" l="0" r="0" t="0"/>
+                  <wp:docPr descr="" title="" id="105" name="Picture"/>
+                  <a:graphic>
+                    <a:graphicData uri="http://schemas.openxmlformats.org/drawingml/2006/picture">
+                      <pic:pic>
+                        <pic:nvPicPr>
+                          <pic:cNvPr descr="algebra-exponentials_files/figure-docx/contour-line-plot-1.png" id="106" name="Picture"/>
+                          <pic:cNvPicPr>
+                            <a:picLocks noChangeArrowheads="1" noChangeAspect="1"/>
+                          </pic:cNvPicPr>
+                        </pic:nvPicPr>
+                        <pic:blipFill>
+                          <a:blip r:embed="rId104"/>
+                          <a:stretch>
+                            <a:fillRect/>
+                          </a:stretch>
+                        </pic:blipFill>
+                        <pic:spPr bwMode="auto">
+                          <a:xfrm>
+                            <a:off x="0" y="0"/>
+                            <a:ext cx="4620126" cy="4158113"/>
+                          </a:xfrm>
+                          <a:prstGeom prst="rect">
+                            <a:avLst/>
+                          </a:prstGeom>
+                          <a:noFill/>
+                          <a:ln w="9525">
+                            <a:noFill/>
+                            <a:headEnd/>
+                            <a:tailEnd/>
+                          </a:ln>
+                        </pic:spPr>
+                      </pic:pic>
+                    </a:graphicData>
+                  </a:graphic>
+                </wp:inline>
+              </w:drawing>
+            </w:r>
+          </w:p>
+          <w:p>
+            <w:pPr>
+              <w:jc w:val="center"/>
+            </w:pPr>
+            <w:pPr>
+              <w:jc w:val="left"/>
+              <w:spacing w:before="200"/>
+              <w:pStyle w:val="ImageCaption"/>
+            </w:pPr>
+            <w:r>
+              <w:t xml:space="preserve">Figure 1: The contour lines of</w:t>
+            </w:r>
+            <w:r>
+              <w:t xml:space="preserve"> </w:t>
+            </w:r>
+            <m:oMath>
+              <m:r>
+                <m:t>g</m:t>
+              </m:r>
+              <m:r>
+                <m:rPr>
+                  <m:sty m:val="p"/>
+                </m:rPr>
+                <m:t>(</m:t>
+              </m:r>
+              <m:r>
+                <m:t>b</m:t>
+              </m:r>
+              <m:r>
+                <m:rPr>
+                  <m:sty m:val="p"/>
+                </m:rPr>
+                <m:t>,</m:t>
+              </m:r>
+              <m:r>
+                <m:t>c</m:t>
+              </m:r>
+              <m:r>
+                <m:rPr>
+                  <m:sty m:val="p"/>
+                </m:rPr>
+                <m:t>)</m:t>
+              </m:r>
+              <m:r>
+                <m:rPr>
+                  <m:sty m:val="p"/>
+                </m:rPr>
+                <m:t>=</m:t>
+              </m:r>
+              <m:sSup>
+                <m:e>
+                  <m:r>
+                    <m:t>b</m:t>
+                  </m:r>
+                </m:e>
+                <m:sup>
+                  <m:r>
+                    <m:t>2</m:t>
+                  </m:r>
+                </m:sup>
+              </m:sSup>
+              <m:r>
+                <m:rPr>
+                  <m:sty m:val="p"/>
+                </m:rPr>
+                <m:t>+</m:t>
+              </m:r>
+              <m:sSup>
+                <m:e>
+                  <m:r>
+                    <m:t>c</m:t>
+                  </m:r>
+                </m:e>
+                <m:sup>
+                  <m:r>
+                    <m:t>2</m:t>
+                  </m:r>
+                </m:sup>
+              </m:sSup>
+            </m:oMath>
+            <w:r>
+              <w:t xml:space="preserve"> </w:t>
+            </w:r>
+            <w:r>
+              <w:t xml:space="preserve">at heights</w:t>
+            </w:r>
+            <w:r>
+              <w:t xml:space="preserve"> </w:t>
+            </w:r>
+            <m:oMath>
+              <m:r>
+                <m:t>1</m:t>
+              </m:r>
+            </m:oMath>
+            <w:r>
+              <w:t xml:space="preserve">,</w:t>
+            </w:r>
+            <w:r>
+              <w:t xml:space="preserve"> </w:t>
+            </w:r>
+            <m:oMath>
+              <m:r>
+                <m:t>4</m:t>
+              </m:r>
+            </m:oMath>
+            <w:r>
+              <w:t xml:space="preserve"> </w:t>
+            </w:r>
+            <w:r>
+              <w:t xml:space="preserve">and</w:t>
+            </w:r>
+            <w:r>
+              <w:t xml:space="preserve"> </w:t>
+            </w:r>
+            <m:oMath>
+              <m:r>
+                <m:t>9</m:t>
+              </m:r>
+            </m:oMath>
+            <w:r>
+              <w:t xml:space="preserve">.</w:t>
+            </w:r>
+            <w:r>
+              <w:t xml:space="preserve"> </w:t>
+            </w:r>
+            <w:r>
+              <w:t xml:space="preserve">The dots mark the points</w:t>
+            </w:r>
+            <w:r>
+              <w:t xml:space="preserve"> </w:t>
+            </w:r>
+            <m:oMath>
+              <m:r>
+                <m:rPr>
+                  <m:sty m:val="p"/>
+                </m:rPr>
+                <m:t>(</m:t>
+              </m:r>
+              <m:r>
+                <m:t>2</m:t>
+              </m:r>
+              <m:r>
+                <m:rPr>
+                  <m:sty m:val="p"/>
+                </m:rPr>
+                <m:t>,</m:t>
+              </m:r>
+              <m:r>
+                <m:t>0</m:t>
+              </m:r>
+              <m:r>
+                <m:rPr>
+                  <m:sty m:val="p"/>
+                </m:rPr>
+                <m:t>)</m:t>
+              </m:r>
+            </m:oMath>
+            <w:r>
+              <w:t xml:space="preserve"> </w:t>
+            </w:r>
+            <w:r>
+              <w:t xml:space="preserve">and</w:t>
+            </w:r>
+            <w:r>
+              <w:t xml:space="preserve"> </w:t>
+            </w:r>
+            <m:oMath>
+              <m:r>
+                <m:rPr>
+                  <m:sty m:val="p"/>
+                </m:rPr>
+                <m:t>(</m:t>
+              </m:r>
+              <m:r>
+                <m:t>0</m:t>
+              </m:r>
+              <m:r>
+                <m:rPr>
+                  <m:sty m:val="p"/>
+                </m:rPr>
+                <m:t>,</m:t>
+              </m:r>
+              <m:r>
+                <m:rPr>
+                  <m:sty m:val="p"/>
+                </m:rPr>
+                <m:t>−</m:t>
+              </m:r>
+              <m:r>
+                <m:t>2</m:t>
+              </m:r>
+              <m:r>
+                <m:rPr>
+                  <m:sty m:val="p"/>
+                </m:rPr>
+                <m:t>)</m:t>
+              </m:r>
+            </m:oMath>
+            <w:r>
+              <w:t xml:space="preserve"> </w:t>
+            </w:r>
+            <w:r>
+              <w:t xml:space="preserve">of the example on the circle at height</w:t>
+            </w:r>
+            <w:r>
+              <w:t xml:space="preserve"> </w:t>
+            </w:r>
+            <m:oMath>
+              <m:r>
+                <m:t>4</m:t>
+              </m:r>
+            </m:oMath>
+            <w:r>
+              <w:t xml:space="preserve">.</w:t>
+            </w:r>
+          </w:p>
+          <w:bookmarkEnd w:id="107"/>
+        </w:tc>
+      </w:tr>
+    </w:tbl>
+    <w:bookmarkEnd w:id="108"/>
+    <w:bookmarkStart w:id="109" w:name="rem-contour-line-surface"/>
     <w:p>
       <w:pPr>
         <w:pStyle w:val="BodyText"/>
@@ -22906,8 +23187,8 @@
         <w:t xml:space="preserve">.</w:t>
       </w:r>
     </w:p>
-    <w:bookmarkEnd w:id="105"/>
-    <w:bookmarkStart w:id="106" w:name="exr-exp-vs-mult"/>
+    <w:bookmarkEnd w:id="109"/>
+    <w:bookmarkStart w:id="110" w:name="exr-exp-vs-mult"/>
     <w:p>
       <w:pPr>
         <w:pStyle w:val="BodyText"/>
@@ -22991,8 +23272,8 @@
         <w:t xml:space="preserve">?</w:t>
       </w:r>
     </w:p>
-    <w:bookmarkEnd w:id="106"/>
-    <w:bookmarkStart w:id="107" w:name="sol-exp-vs-mult"/>
+    <w:bookmarkEnd w:id="110"/>
+    <w:bookmarkStart w:id="111" w:name="sol-exp-vs-mult"/>
     <w:p>
       <w:pPr>
         <w:pStyle w:val="BodyText"/>
@@ -24802,7 +25083,7 @@
           <w:rPr>
             <w:rStyle w:val="Hyperlink"/>
           </w:rPr>
-          <w:t xml:space="preserve">Figure 2</w:t>
+          <w:t xml:space="preserve">Figure 3</w:t>
         </w:r>
       </w:hyperlink>
       <w:r>
@@ -24835,7 +25116,7 @@
         <w:t xml:space="preserve">cases.</w:t>
       </w:r>
     </w:p>
-    <w:bookmarkEnd w:id="107"/>
+    <w:bookmarkEnd w:id="111"/>
     <w:tbl>
       <w:tblPr>
         <w:tblStyle w:val="Table"/>
@@ -24849,7 +25130,7 @@
       <w:tr>
         <w:tc>
           <w:tcPr/>
-          <w:bookmarkStart w:id="108" w:name="fig-double-exponential"/>
+          <w:bookmarkStart w:id="112" w:name="fig-double-exponential"/>
           <w:p>
             <w:pPr>
               <w:pStyle w:val="Compact"/>
@@ -24873,7 +25154,7 @@
               <w:pStyle w:val="ImageCaption"/>
             </w:pPr>
             <w:r>
-              <w:t xml:space="preserve">Figure 1: Graph of</w:t>
+              <w:t xml:space="preserve">Figure 2: Graph of</w:t>
             </w:r>
             <w:r>
               <w:t xml:space="preserve"> </w:t>
@@ -24916,7 +25197,7 @@
               </m:sSup>
             </m:oMath>
           </w:p>
-          <w:bookmarkEnd w:id="108"/>
+          <w:bookmarkEnd w:id="112"/>
         </w:tc>
       </w:tr>
     </w:tbl>
@@ -24934,7 +25215,7 @@
       <w:tr>
         <w:tc>
           <w:tcPr/>
-          <w:bookmarkStart w:id="109" w:name="fig-double-exponential2"/>
+          <w:bookmarkStart w:id="113" w:name="fig-double-exponential2"/>
           <w:p>
             <w:pPr>
               <w:pStyle w:val="Compact"/>
@@ -24958,7 +25239,7 @@
               <w:pStyle w:val="ImageCaption"/>
             </w:pPr>
             <w:r>
-              <w:t xml:space="preserve">Figure 2:</w:t>
+              <w:t xml:space="preserve">Figure 3:</w:t>
             </w:r>
             <w:r>
               <w:t xml:space="preserve"> </w:t>
@@ -25119,11 +25400,11 @@
               <w:t xml:space="preserve">.</w:t>
             </w:r>
           </w:p>
-          <w:bookmarkEnd w:id="109"/>
+          <w:bookmarkEnd w:id="113"/>
         </w:tc>
       </w:tr>
     </w:tbl>
-    <w:bookmarkStart w:id="110" w:name="thm-exp-vs-mult"/>
+    <w:bookmarkStart w:id="114" w:name="thm-exp-vs-mult"/>
     <w:p>
       <w:pPr>
         <w:pStyle w:val="BodyText"/>
@@ -25793,7 +26074,7 @@
         <w:t xml:space="preserve">.</w:t>
       </w:r>
     </w:p>
-    <w:bookmarkEnd w:id="110"/>
+    <w:bookmarkEnd w:id="114"/>
     <w:p>
       <w:pPr>
         <w:pStyle w:val="FirstParagraph"/>
@@ -25840,7 +26121,7 @@
         <w:t xml:space="preserve">.</w:t>
       </w:r>
     </w:p>
-    <w:bookmarkStart w:id="111" w:name="exr-double-exponential"/>
+    <w:bookmarkStart w:id="115" w:name="exr-double-exponential"/>
     <w:p>
       <w:pPr>
         <w:pStyle w:val="BodyText"/>
@@ -25999,8 +26280,8 @@
         <w:t xml:space="preserve">?</w:t>
       </w:r>
     </w:p>
-    <w:bookmarkEnd w:id="111"/>
-    <w:bookmarkStart w:id="113" w:name="sol-double-exponential"/>
+    <w:bookmarkEnd w:id="115"/>
+    <w:bookmarkStart w:id="117" w:name="sol-double-exponential"/>
     <w:p>
       <w:pPr>
         <w:pStyle w:val="BodyText"/>
@@ -26425,7 +26706,7 @@
       <w:pPr>
         <w:pStyle w:val="BodyText"/>
       </w:pPr>
-      <w:bookmarkStart w:id="112" w:name="eq-double-exp-log-scale"/>
+      <w:bookmarkStart w:id="116" w:name="eq-double-exp-log-scale"/>
       <m:oMathPara>
         <m:oMathParaPr>
           <m:jc m:val="center"/>
@@ -26732,7 +27013,7 @@
           </m:r>
         </m:oMath>
       </m:oMathPara>
-      <w:bookmarkEnd w:id="112"/>
+      <w:bookmarkEnd w:id="116"/>
     </w:p>
     <w:p>
       <w:pPr>
@@ -28125,8 +28406,8 @@
         </m:oMath>
       </m:oMathPara>
     </w:p>
-    <w:bookmarkEnd w:id="113"/>
-    <w:bookmarkStart w:id="114" w:name="thm-double-exponential"/>
+    <w:bookmarkEnd w:id="117"/>
+    <w:bookmarkStart w:id="118" w:name="thm-double-exponential"/>
     <w:p>
       <w:pPr>
         <w:pStyle w:val="FirstParagraph"/>
@@ -28460,7 +28741,7 @@
         <w:t xml:space="preserve">.</w:t>
       </w:r>
     </w:p>
-    <w:bookmarkEnd w:id="114"/>
+    <w:bookmarkEnd w:id="118"/>
     <w:p>
       <w:pPr>
         <w:pStyle w:val="FirstParagraph"/>
@@ -28507,8 +28788,8 @@
         <w:t xml:space="preserve">.</w:t>
       </w:r>
     </w:p>
-    <w:bookmarkStart w:id="145" w:name="refs"/>
-    <w:bookmarkStart w:id="116" w:name="ref-wikipedia_polynomial"/>
+    <w:bookmarkStart w:id="149" w:name="refs"/>
+    <w:bookmarkStart w:id="120" w:name="ref-wikipedia_polynomial"/>
     <w:p>
       <w:pPr>
         <w:pStyle w:val="Bibliography"/>
@@ -28555,7 +28836,7 @@
       <w:r>
         <w:t xml:space="preserve"> </w:t>
       </w:r>
-      <w:hyperlink r:id="rId115">
+      <w:hyperlink r:id="rId119">
         <w:r>
           <w:rPr>
             <w:rStyle w:val="Hyperlink"/>
@@ -28564,8 +28845,8 @@
         </w:r>
       </w:hyperlink>
     </w:p>
-    <w:bookmarkEnd w:id="116"/>
-    <w:bookmarkStart w:id="118" w:name="ref-wikipedia_quadratic_function"/>
+    <w:bookmarkEnd w:id="120"/>
+    <w:bookmarkStart w:id="122" w:name="ref-wikipedia_quadratic_function"/>
     <w:p>
       <w:pPr>
         <w:pStyle w:val="Bibliography"/>
@@ -28612,7 +28893,7 @@
       <w:r>
         <w:t xml:space="preserve"> </w:t>
       </w:r>
-      <w:hyperlink r:id="rId117">
+      <w:hyperlink r:id="rId121">
         <w:r>
           <w:rPr>
             <w:rStyle w:val="Hyperlink"/>
@@ -28621,8 +28902,8 @@
         </w:r>
       </w:hyperlink>
     </w:p>
-    <w:bookmarkEnd w:id="118"/>
-    <w:bookmarkStart w:id="120" w:name="ref-wikipedia_parabola"/>
+    <w:bookmarkEnd w:id="122"/>
+    <w:bookmarkStart w:id="124" w:name="ref-wikipedia_parabola"/>
     <w:p>
       <w:pPr>
         <w:pStyle w:val="Bibliography"/>
@@ -28669,7 +28950,7 @@
       <w:r>
         <w:t xml:space="preserve"> </w:t>
       </w:r>
-      <w:hyperlink r:id="rId119">
+      <w:hyperlink r:id="rId123">
         <w:r>
           <w:rPr>
             <w:rStyle w:val="Hyperlink"/>
@@ -28678,8 +28959,8 @@
         </w:r>
       </w:hyperlink>
     </w:p>
-    <w:bookmarkEnd w:id="120"/>
-    <w:bookmarkStart w:id="122" w:name="ref-wikipedia_affine_transformation"/>
+    <w:bookmarkEnd w:id="124"/>
+    <w:bookmarkStart w:id="126" w:name="ref-wikipedia_affine_transformation"/>
     <w:p>
       <w:pPr>
         <w:pStyle w:val="Bibliography"/>
@@ -28726,7 +29007,7 @@
       <w:r>
         <w:t xml:space="preserve"> </w:t>
       </w:r>
-      <w:hyperlink r:id="rId121">
+      <w:hyperlink r:id="rId125">
         <w:r>
           <w:rPr>
             <w:rStyle w:val="Hyperlink"/>
@@ -28735,8 +29016,8 @@
         </w:r>
       </w:hyperlink>
     </w:p>
-    <w:bookmarkEnd w:id="122"/>
-    <w:bookmarkStart w:id="124" w:name="ref-wikipedia_slope"/>
+    <w:bookmarkEnd w:id="126"/>
+    <w:bookmarkStart w:id="128" w:name="ref-wikipedia_slope"/>
     <w:p>
       <w:pPr>
         <w:pStyle w:val="Bibliography"/>
@@ -28783,7 +29064,7 @@
       <w:r>
         <w:t xml:space="preserve"> </w:t>
       </w:r>
-      <w:hyperlink r:id="rId123">
+      <w:hyperlink r:id="rId127">
         <w:r>
           <w:rPr>
             <w:rStyle w:val="Hyperlink"/>
@@ -28792,8 +29073,8 @@
         </w:r>
       </w:hyperlink>
     </w:p>
-    <w:bookmarkEnd w:id="124"/>
-    <w:bookmarkStart w:id="126" w:name="ref-wikipedia_linear_function"/>
+    <w:bookmarkEnd w:id="128"/>
+    <w:bookmarkStart w:id="130" w:name="ref-wikipedia_linear_function"/>
     <w:p>
       <w:pPr>
         <w:pStyle w:val="Bibliography"/>
@@ -28840,7 +29121,7 @@
       <w:r>
         <w:t xml:space="preserve"> </w:t>
       </w:r>
-      <w:hyperlink r:id="rId125">
+      <w:hyperlink r:id="rId129">
         <w:r>
           <w:rPr>
             <w:rStyle w:val="Hyperlink"/>
@@ -28849,8 +29130,8 @@
         </w:r>
       </w:hyperlink>
     </w:p>
-    <w:bookmarkEnd w:id="126"/>
-    <w:bookmarkStart w:id="128" w:name="ref-wikipedia_limit_of_a_sequence"/>
+    <w:bookmarkEnd w:id="130"/>
+    <w:bookmarkStart w:id="132" w:name="ref-wikipedia_limit_of_a_sequence"/>
     <w:p>
       <w:pPr>
         <w:pStyle w:val="Bibliography"/>
@@ -28897,7 +29178,7 @@
       <w:r>
         <w:t xml:space="preserve"> </w:t>
       </w:r>
-      <w:hyperlink r:id="rId127">
+      <w:hyperlink r:id="rId131">
         <w:r>
           <w:rPr>
             <w:rStyle w:val="Hyperlink"/>
@@ -28906,8 +29187,8 @@
         </w:r>
       </w:hyperlink>
     </w:p>
-    <w:bookmarkEnd w:id="128"/>
-    <w:bookmarkStart w:id="130" w:name="ref-wikipedia_series_mathematics"/>
+    <w:bookmarkEnd w:id="132"/>
+    <w:bookmarkStart w:id="134" w:name="ref-wikipedia_series_mathematics"/>
     <w:p>
       <w:pPr>
         <w:pStyle w:val="Bibliography"/>
@@ -28954,7 +29235,7 @@
       <w:r>
         <w:t xml:space="preserve"> </w:t>
       </w:r>
-      <w:hyperlink r:id="rId129">
+      <w:hyperlink r:id="rId133">
         <w:r>
           <w:rPr>
             <w:rStyle w:val="Hyperlink"/>
@@ -28963,8 +29244,8 @@
         </w:r>
       </w:hyperlink>
     </w:p>
-    <w:bookmarkEnd w:id="130"/>
-    <w:bookmarkStart w:id="132" w:name="X0550f6b86499719df0a5564f859fdf3dd90e1bc"/>
+    <w:bookmarkEnd w:id="134"/>
+    <w:bookmarkStart w:id="136" w:name="X0550f6b86499719df0a5564f859fdf3dd90e1bc"/>
     <w:p>
       <w:pPr>
         <w:pStyle w:val="Bibliography"/>
@@ -29011,7 +29292,7 @@
       <w:r>
         <w:t xml:space="preserve"> </w:t>
       </w:r>
-      <w:hyperlink r:id="rId131">
+      <w:hyperlink r:id="rId135">
         <w:r>
           <w:rPr>
             <w:rStyle w:val="Hyperlink"/>
@@ -29020,8 +29301,8 @@
         </w:r>
       </w:hyperlink>
     </w:p>
-    <w:bookmarkEnd w:id="132"/>
-    <w:bookmarkStart w:id="134" w:name="ref-wikipedia_exponential_function"/>
+    <w:bookmarkEnd w:id="136"/>
+    <w:bookmarkStart w:id="138" w:name="ref-wikipedia_exponential_function"/>
     <w:p>
       <w:pPr>
         <w:pStyle w:val="Bibliography"/>
@@ -29068,7 +29349,7 @@
       <w:r>
         <w:t xml:space="preserve"> </w:t>
       </w:r>
-      <w:hyperlink r:id="rId133">
+      <w:hyperlink r:id="rId137">
         <w:r>
           <w:rPr>
             <w:rStyle w:val="Hyperlink"/>
@@ -29077,8 +29358,8 @@
         </w:r>
       </w:hyperlink>
     </w:p>
-    <w:bookmarkEnd w:id="134"/>
-    <w:bookmarkStart w:id="136" w:name="ref-wikipedia_e_mathematical_constant"/>
+    <w:bookmarkEnd w:id="138"/>
+    <w:bookmarkStart w:id="140" w:name="ref-wikipedia_e_mathematical_constant"/>
     <w:p>
       <w:pPr>
         <w:pStyle w:val="Bibliography"/>
@@ -29125,7 +29406,7 @@
       <w:r>
         <w:t xml:space="preserve"> </w:t>
       </w:r>
-      <w:hyperlink r:id="rId135">
+      <w:hyperlink r:id="rId139">
         <w:r>
           <w:rPr>
             <w:rStyle w:val="Hyperlink"/>
@@ -29134,8 +29415,8 @@
         </w:r>
       </w:hyperlink>
     </w:p>
-    <w:bookmarkEnd w:id="136"/>
-    <w:bookmarkStart w:id="138" w:name="ref-wikipedia_natural_logarithm"/>
+    <w:bookmarkEnd w:id="140"/>
+    <w:bookmarkStart w:id="142" w:name="ref-wikipedia_natural_logarithm"/>
     <w:p>
       <w:pPr>
         <w:pStyle w:val="Bibliography"/>
@@ -29182,7 +29463,7 @@
       <w:r>
         <w:t xml:space="preserve"> </w:t>
       </w:r>
-      <w:hyperlink r:id="rId137">
+      <w:hyperlink r:id="rId141">
         <w:r>
           <w:rPr>
             <w:rStyle w:val="Hyperlink"/>
@@ -29191,8 +29472,8 @@
         </w:r>
       </w:hyperlink>
     </w:p>
-    <w:bookmarkEnd w:id="138"/>
-    <w:bookmarkStart w:id="140" w:name="ref-wikipedia_logarithm"/>
+    <w:bookmarkEnd w:id="142"/>
+    <w:bookmarkStart w:id="144" w:name="ref-wikipedia_logarithm"/>
     <w:p>
       <w:pPr>
         <w:pStyle w:val="Bibliography"/>
@@ -29239,7 +29520,7 @@
       <w:r>
         <w:t xml:space="preserve"> </w:t>
       </w:r>
-      <w:hyperlink r:id="rId139">
+      <w:hyperlink r:id="rId143">
         <w:r>
           <w:rPr>
             <w:rStyle w:val="Hyperlink"/>
@@ -29248,8 +29529,8 @@
         </w:r>
       </w:hyperlink>
     </w:p>
-    <w:bookmarkEnd w:id="140"/>
-    <w:bookmarkStart w:id="142" w:name="X5bbf2d245759a3fafc9c46669854129ba2658aa"/>
+    <w:bookmarkEnd w:id="144"/>
+    <w:bookmarkStart w:id="146" w:name="X5bbf2d245759a3fafc9c46669854129ba2658aa"/>
     <w:p>
       <w:pPr>
         <w:pStyle w:val="Bibliography"/>
@@ -29296,7 +29577,7 @@
       <w:r>
         <w:t xml:space="preserve"> </w:t>
       </w:r>
-      <w:hyperlink r:id="rId141">
+      <w:hyperlink r:id="rId145">
         <w:r>
           <w:rPr>
             <w:rStyle w:val="Hyperlink"/>
@@ -29305,8 +29586,8 @@
         </w:r>
       </w:hyperlink>
     </w:p>
-    <w:bookmarkEnd w:id="142"/>
-    <w:bookmarkStart w:id="144" w:name="ref-wikipedia_contour_line"/>
+    <w:bookmarkEnd w:id="146"/>
+    <w:bookmarkStart w:id="148" w:name="ref-wikipedia_contour_line"/>
     <w:p>
       <w:pPr>
         <w:pStyle w:val="Bibliography"/>
@@ -29353,7 +29634,7 @@
       <w:r>
         <w:t xml:space="preserve"> </w:t>
       </w:r>
-      <w:hyperlink r:id="rId143">
+      <w:hyperlink r:id="rId147">
         <w:r>
           <w:rPr>
             <w:rStyle w:val="Hyperlink"/>
@@ -29362,9 +29643,9 @@
         </w:r>
       </w:hyperlink>
     </w:p>
-    <w:bookmarkEnd w:id="144"/>
-    <w:bookmarkEnd w:id="145"/>
-    <w:bookmarkEnd w:id="146"/>
+    <w:bookmarkEnd w:id="148"/>
+    <w:bookmarkEnd w:id="149"/>
+    <w:bookmarkEnd w:id="150"/>
     <w:sectPr>
       <w:footnotePr>
         <w:numRestart w:val="eachSect"/>

</xml_diff>